<commit_message>
feat: complete account access management and photo support
</commit_message>
<xml_diff>
--- a/docs/DICTIONNAIRE_COMPLET_API_EBAC.docx
+++ b/docs/DICTIONNAIRE_COMPLET_API_EBAC.docx
@@ -17,12 +17,12 @@
     </w:p>
     <w:p>
       <w:r>
-        <w:t>Version : API v1  </w:t>
-      </w:r>
-    </w:p>
-    <w:p>
-      <w:r>
-        <w:t>Base URL : https://api-ebac.severinzran.ci/api/v1  </w:t>
+        <w:t>Version : API v1</w:t>
+      </w:r>
+    </w:p>
+    <w:p>
+      <w:r>
+        <w:t>Base URL : https://api-ebac.severinzran.ci/api/v1</w:t>
       </w:r>
     </w:p>
     <w:p>
@@ -180,7 +180,7 @@
     </w:p>
     <w:p>
       <w:r>
-        <w:t>Les codes USR-, ROL-, PER- et MEN- sont générés par l’API. Le frontend ne doit jamais les envoyer.</w:t>
+        <w:t>Les codes USR-, PER- et MEN- sont générés par l’API. Le code du rôle est obligatoirement saisi par le frontend.</w:t>
       </w:r>
     </w:p>
     <w:p>
@@ -437,7 +437,7 @@
         <w:pStyle w:val="TableText"/>
       </w:pPr>
       <w:r>
-        <w:t>`code` | chaîne | API | Automatique : `ROL-000001`</w:t>
+        <w:t>`code` | chaîne(30) | Front | Obligatoire, unique, normalisé en majuscules</w:t>
       </w:r>
     </w:p>
     <w:p>
@@ -461,6 +461,14 @@
         <w:pStyle w:val="TableText"/>
       </w:pPr>
       <w:r>
+        <w:t>`actif` | booléen | Front | Active ou désactive le rôle</w:t>
+      </w:r>
+    </w:p>
+    <w:p>
+      <w:pPr>
+        <w:pStyle w:val="TableText"/>
+      </w:pPr>
+      <w:r>
         <w:t>`permissions` | tableau | Front/API | Permissions associées</w:t>
       </w:r>
     </w:p>
@@ -469,6 +477,14 @@
         <w:pStyle w:val="TableText"/>
       </w:pPr>
       <w:r>
+        <w:t>`autorisations` | tableau | Front/API | Couples `menu_id` et `action_ids` cochés</w:t>
+      </w:r>
+    </w:p>
+    <w:p>
+      <w:pPr>
+        <w:pStyle w:val="TableText"/>
+      </w:pPr>
+      <w:r>
         <w:t>`permissions_count` | entier | API | Nombre de permissions</w:t>
       </w:r>
     </w:p>
@@ -789,6 +805,14 @@
         <w:pStyle w:val="TableText"/>
       </w:pPr>
       <w:r>
+        <w:t>`actions` | tableau | Front/API | Actions proposées pour ce module</w:t>
+      </w:r>
+    </w:p>
+    <w:p>
+      <w:pPr>
+        <w:pStyle w:val="TableText"/>
+      </w:pPr>
+      <w:r>
         <w:t>`enfants` | tableau | API | Sous-menus</w:t>
       </w:r>
     </w:p>
@@ -802,7 +826,81 @@
         <w:pStyle w:val="Heading2"/>
       </w:pPr>
       <w:r>
-        <w:t>2.6 Pagination</w:t>
+        <w:t>2.6 Tables de liaison des autorisations</w:t>
+      </w:r>
+    </w:p>
+    <w:p>
+      <w:r>
+        <w:t xml:space="preserve"> </w:t>
+      </w:r>
+    </w:p>
+    <w:p>
+      <w:pPr>
+        <w:pStyle w:val="TableText"/>
+      </w:pPr>
+      <w:r>
+        <w:t>Table | Clé | Description</w:t>
+      </w:r>
+    </w:p>
+    <w:p>
+      <w:pPr>
+        <w:pStyle w:val="TableText"/>
+      </w:pPr>
+      <w:r>
+        <w:t>---|---|---</w:t>
+      </w:r>
+    </w:p>
+    <w:p>
+      <w:pPr>
+        <w:pStyle w:val="TableText"/>
+      </w:pPr>
+      <w:r>
+        <w:t>`role_permissions` | `id_role + id_permission` | Permissions métier attribuées au rôle</w:t>
+      </w:r>
+    </w:p>
+    <w:p>
+      <w:pPr>
+        <w:pStyle w:val="TableText"/>
+      </w:pPr>
+      <w:r>
+        <w:t>`permission_actions` | `id_permission + id_action` | Actions rattachées à une permission</w:t>
+      </w:r>
+    </w:p>
+    <w:p>
+      <w:pPr>
+        <w:pStyle w:val="TableText"/>
+      </w:pPr>
+      <w:r>
+        <w:t>`menu_permissions` | `id_menu + id_permission` | Permissions donnant accès au menu</w:t>
+      </w:r>
+    </w:p>
+    <w:p>
+      <w:pPr>
+        <w:pStyle w:val="TableText"/>
+      </w:pPr>
+      <w:r>
+        <w:t>`menu_actions` | `id_menu + id_action` | Actions disponibles dans la ligne du module</w:t>
+      </w:r>
+    </w:p>
+    <w:p>
+      <w:pPr>
+        <w:pStyle w:val="TableText"/>
+      </w:pPr>
+      <w:r>
+        <w:t>`role_menu_actions` | `id_role + id_menu + id_action` | Cases cochées de la matrice du rôle</w:t>
+      </w:r>
+    </w:p>
+    <w:p>
+      <w:r>
+        <w:t xml:space="preserve"> </w:t>
+      </w:r>
+    </w:p>
+    <w:p>
+      <w:pPr>
+        <w:pStyle w:val="Heading2"/>
+      </w:pPr>
+      <w:r>
+        <w:t>2.7 Pagination</w:t>
       </w:r>
     </w:p>
     <w:p>
@@ -1733,7 +1831,7 @@
     </w:p>
     <w:p>
       <w:r>
-        <w:t>Query : recherche, statut, idrole, isactive, parpage, page.  </w:t>
+        <w:t>Query : recherche, statut, idrole, isactive, parpage, page.</w:t>
       </w:r>
     </w:p>
     <w:p>
@@ -2048,7 +2146,7 @@
     </w:p>
     <w:p>
       <w:r>
-        <w:t>Champs de création facultatifs, plus password (min 8) et passwordconfirmation.  </w:t>
+        <w:t>Champs de création facultatifs, plus password (min 8) et passwordconfirmation.</w:t>
       </w:r>
     </w:p>
     <w:p>
@@ -2076,7 +2174,7 @@
     </w:p>
     <w:p>
       <w:r>
-        <w:t>Réponse 200 : {"message":"Compte supprimé avec succès."}.  </w:t>
+        <w:t>Réponse 200 : {"message":"Compte supprimé avec succès."}.</w:t>
       </w:r>
     </w:p>
     <w:p>
@@ -2163,7 +2261,7 @@
     </w:p>
     <w:p>
       <w:r>
-        <w:t>Champs : civiliteid, nom, prenoms, email, photo, motdepasseactuel, password, passwordconfirmation. Le mot de passe actuel est obligatoire si un nouveau mot de passe est envoyé.  </w:t>
+        <w:t>Champs : civiliteid, nom, prenoms, email, photo, motdepasseactuel, password, passwordconfirmation. Le mot de passe actuel est obligatoire si un nouveau mot de passe est envoyé.</w:t>
       </w:r>
     </w:p>
     <w:p>
@@ -2232,7 +2330,7 @@
           <w:sz w:val="18"/>
           <w:color w:val="17365D"/>
         </w:rPr>
-        <w:t>{"libelle":"Gestionnaire","description":"Gestion des étudiants","permission_ids":[1,2]}</w:t>
+        <w:t>{"code":"GESTIONNAIRE","libelle":"Gestionnaire","description":"Gestion des étudiants","actif":true,"permission_ids":[1,2],"autorisations":[{"menu_id":1,"action_ids":[1,3,4]}]}</w:t>
       </w:r>
     </w:p>
     <w:p>
@@ -2257,7 +2355,7 @@
           <w:sz w:val="18"/>
           <w:color w:val="17365D"/>
         </w:rPr>
-        <w:t>{"message":"Rôle créé avec succès.","role":{"id":2,"code":"ROL-000001","libelle":"Gestionnaire","description":"Gestion des étudiants","permissions":[{"id":1,"code":"PER-000001","libelle":"Étudiants"}]}}</w:t>
+        <w:t>{"message":"Rôle créé avec succès.","role":{"id":2,"code":"GESTIONNAIRE","libelle":"Gestionnaire","description":"Gestion des étudiants","permissions":[{"id":1,"code":"PER-000001","libelle":"Étudiants"}]}}</w:t>
       </w:r>
     </w:p>
     <w:p>
@@ -2303,7 +2401,7 @@
     </w:p>
     <w:p>
       <w:r>
-        <w:t>Champs : libelle, description, permissionids. code interdit.  </w:t>
+        <w:t>Champs : code, libelle, description, permissionids. À la création, code est obligatoire, unique, limité à 30 caractères et converti en majuscules.</w:t>
       </w:r>
     </w:p>
     <w:p>
@@ -2359,6 +2457,90 @@
         <w:pStyle w:val="Heading2"/>
       </w:pPr>
       <w:r>
+        <w:t>GET `/administration/roles/matrice-autorisations`</w:t>
+      </w:r>
+    </w:p>
+    <w:p>
+      <w:r>
+        <w:t xml:space="preserve"> </w:t>
+      </w:r>
+    </w:p>
+    <w:p>
+      <w:r>
+        <w:t>Réponse 200 : {"modules":[{"menuid":1,"code":"MEN-000001","libelle":"Étudiants","actions":[{"id":1,"code":"VOIR","libelle":"Voir","selectionnee":false}]}]}.</w:t>
+      </w:r>
+    </w:p>
+    <w:p>
+      <w:r>
+        <w:t xml:space="preserve"> </w:t>
+      </w:r>
+    </w:p>
+    <w:p>
+      <w:pPr>
+        <w:pStyle w:val="Heading2"/>
+      </w:pPr>
+      <w:r>
+        <w:t>GET `/administration/roles/{id}/matrice-autorisations`</w:t>
+      </w:r>
+    </w:p>
+    <w:p>
+      <w:r>
+        <w:t xml:space="preserve"> </w:t>
+      </w:r>
+    </w:p>
+    <w:p>
+      <w:r>
+        <w:t>Même matrice avec selectionnee: true pour les cases déjà attribuées au rôle.</w:t>
+      </w:r>
+    </w:p>
+    <w:p>
+      <w:r>
+        <w:t xml:space="preserve"> </w:t>
+      </w:r>
+    </w:p>
+    <w:p>
+      <w:pPr>
+        <w:pStyle w:val="Heading2"/>
+      </w:pPr>
+      <w:r>
+        <w:t>PUT `/administration/roles/{id}/autorisations`</w:t>
+      </w:r>
+    </w:p>
+    <w:p>
+      <w:r>
+        <w:t xml:space="preserve"> </w:t>
+      </w:r>
+    </w:p>
+    <w:p>
+      <w:r>
+        <w:rPr>
+          <w:rFonts w:ascii="Consolas" w:hAnsi="Consolas"/>
+          <w:sz w:val="18"/>
+          <w:color w:val="17365D"/>
+        </w:rPr>
+        <w:t>{"autorisations":[{"menu_id":1,"action_ids":[1,3,4]},{"menu_id":2,"action_ids":[4]}]}</w:t>
+      </w:r>
+    </w:p>
+    <w:p>
+      <w:r>
+        <w:t xml:space="preserve"> </w:t>
+      </w:r>
+    </w:p>
+    <w:p>
+      <w:r>
+        <w:t>Cette requête remplace toute la matrice du rôle.</w:t>
+      </w:r>
+    </w:p>
+    <w:p>
+      <w:r>
+        <w:t xml:space="preserve"> </w:t>
+      </w:r>
+    </w:p>
+    <w:p>
+      <w:pPr>
+        <w:pStyle w:val="Heading2"/>
+      </w:pPr>
+      <w:r>
         <w:t>DELETE `/administration/roles/{id}`</w:t>
       </w:r>
     </w:p>
@@ -2519,7 +2701,7 @@
     </w:p>
     <w:p>
       <w:r>
-        <w:t>Champs : libelle, description. code interdit.  </w:t>
+        <w:t>Champs : libelle, description. code interdit.</w:t>
       </w:r>
     </w:p>
     <w:p>
@@ -2720,7 +2902,7 @@
     </w:p>
     <w:p>
       <w:r>
-        <w:t>Champs : libelle, description, actif. code interdit et reste immuable.  </w:t>
+        <w:t>Champs : libelle, description, actif. code interdit et reste immuable.</w:t>
       </w:r>
     </w:p>
     <w:p>
@@ -2922,7 +3104,17 @@
           <w:sz w:val="18"/>
           <w:color w:val="17365D"/>
         </w:rPr>
-        <w:t xml:space="preserve">  "permission_ids": [1]</w:t>
+        <w:t xml:space="preserve">  "permission_ids": [1],</w:t>
+      </w:r>
+    </w:p>
+    <w:p>
+      <w:r>
+        <w:rPr>
+          <w:rFonts w:ascii="Consolas" w:hAnsi="Consolas"/>
+          <w:sz w:val="18"/>
+          <w:color w:val="17365D"/>
+        </w:rPr>
+        <w:t xml:space="preserve">  "action_ids": [1, 2, 3, 4]</w:t>
       </w:r>
     </w:p>
     <w:p>
@@ -2988,7 +3180,7 @@
     </w:p>
     <w:p>
       <w:r>
-        <w:t>Tous les champs de création sont facultatifs. code interdit. idparent ne peut pas désigner le menu lui-même.  </w:t>
+        <w:t>Tous les champs de création sont facultatifs. code interdit. idparent ne peut pas désigner le menu lui-même.</w:t>
       </w:r>
     </w:p>
     <w:p>
@@ -3393,6 +3585,30 @@
         <w:pStyle w:val="TableText"/>
       </w:pPr>
       <w:r>
+        <w:t>GET | `/administration/roles/matrice-autorisations`</w:t>
+      </w:r>
+    </w:p>
+    <w:p>
+      <w:pPr>
+        <w:pStyle w:val="TableText"/>
+      </w:pPr>
+      <w:r>
+        <w:t>GET | `/administration/roles/{id}/matrice-autorisations`</w:t>
+      </w:r>
+    </w:p>
+    <w:p>
+      <w:pPr>
+        <w:pStyle w:val="TableText"/>
+      </w:pPr>
+      <w:r>
+        <w:t>PUT | `/administration/roles/{id}/autorisations`</w:t>
+      </w:r>
+    </w:p>
+    <w:p>
+      <w:pPr>
+        <w:pStyle w:val="TableText"/>
+      </w:pPr>
+      <w:r>
         <w:t>GET, POST | `/administration/permissions`</w:t>
       </w:r>
     </w:p>
@@ -3516,11 +3732,6 @@
       </w:pPr>
       <w:r>
         <w:t>• Toujours traiter les réponses `401`, `403`, `422` et `429`.</w:t>
-      </w:r>
-    </w:p>
-    <w:p>
-      <w:r>
-        <w:t xml:space="preserve"> </w:t>
       </w:r>
     </w:p>
     <w:p>

</xml_diff>